<commit_message>
Update speaker name to Dr. Sapna Vikram Mewundi
</commit_message>
<xml_diff>
--- a/blackhat_india_submission_proposal.docx
+++ b/blackhat_india_submission_proposal.docx
@@ -29,7 +29,7 @@
           <w:color w:val="111111"/>
           <w:sz w:val="36"/>
         </w:rPr>
-        <w:t>Tinker Tailor LLM Spy: Reconstructing "Deleted" Chats &amp; Hijacking Sessions from Chromium LevelDB Caches</w:t>
+        <w:t>Tinker Tailor LLM Spy: Reconstructing 'Deleted' Chats &amp; Hijacking Sessions from Chromium LevelDB Caches with Verity</w:t>
       </w:r>
     </w:p>
     <w:p>
@@ -70,7 +70,7 @@
           </w:tcPr>
           <w:p>
             <w:r>
-              <w:t>Tinker Tailor LLM Spy: Reconstructing "Deleted" Chats &amp; Hijacking Sessions from Chromium LevelDB Caches</w:t>
+              <w:t>Tinker Tailor LLM Spy: Reconstructing 'Deleted' Chats &amp; Hijacking Sessions from Chromium LevelDB Caches with Verity</w:t>
             </w:r>
           </w:p>
         </w:tc>
@@ -145,7 +145,7 @@
           </w:tcPr>
           <w:p>
             <w:r>
-              <w:t>Sapna (Lead Forensics Researcher, Verity Project)</w:t>
+              <w:t>Dr. Sapna Vikram Mewundi (Lead Forensics Researcher, Verity Project)</w:t>
             </w:r>
           </w:p>
         </w:tc>
@@ -212,7 +212,7 @@
     </w:p>
     <w:p>
       <w:r>
-        <w:t>It’s coming, and you aren’t ready—your first forensic investigation involving Large Language Model (LLM) data leakage. GenAI portals (like ChatGPT, Claude, and Gemini) have become standard corporate utilities. To speed up workflows, developers and executives routinely copy and paste sensitive proprietary source code, internal configurations, and credentials into these clients. But when users click "Delete Chat" or clear histories, does that data actually get erased?</w:t>
+        <w:t>It’s coming, and you aren’t ready—your first forensic investigation involving Large Language Model (LLM) data leakage. GenAI portals (like ChatGPT, Claude, and Gemini) have become standard corporate utilities. To speed up workflows, developers and executives routinely copy and paste sensitive proprietary source code, internal configurations, and credentials into these clients. But when users click 'Delete Chat' or clear histories, does that data actually get erased?</w:t>
       </w:r>
     </w:p>
     <w:p>
@@ -222,7 +222,7 @@
     </w:p>
     <w:p>
       <w:r>
-        <w:t>In this talk, we reveal the low-level serialization structures of client-side LLM databases and how to carve this "deleted" telemetry. We reverse engineer the V8 deserialization format (ValueSerializer), specifically dissecting V8 string tags (OneByteString vs TwoByteString UTF-16LE anomalies) and nested object boundary parsing. We introduce Verity, an open-source, zero-dependency python framework that dynamically sweeps all user profiles, bypasses active Windows file locks, and reconstructs deleted histories. Finally, we establish a cryptographically secured chain of custody using in-browser HMAC-SHA256 verification. Attendees will leave with a ready-to-use incident response playbook and the open-source Verity tool to audit and protect their organizations.</w:t>
+        <w:t>In this talk, we reveal the low-level serialization structures of client-side LLM databases and how to carve this 'deleted' telemetry. We reverse engineer the V8 deserialization format (ValueSerializer), specifically dissecting V8 string tags (OneByteString vs TwoByteString UTF-16LE anomalies) and nested object boundary parsing. We introduce Verity, an open-source, zero-dependency python framework that dynamically sweeps all user profiles, bypasses active Windows file locks, and reconstructs deleted histories. Finally, we establish a cryptographically secured chain of custody using in-browser HMAC-SHA256 verification. Attendees will leave with a ready-to-use incident response playbook and the open-source Verity tool to audit and protect their organizations.</w:t>
       </w:r>
     </w:p>
     <w:p>
@@ -673,7 +673,7 @@
         <w:pStyle w:val="ListBullet"/>
       </w:pPr>
       <w:r>
-        <w:t>3. The dynamic discovery of Profile 3 databases and the instant forensic reassembly of the "deleted" code blocks by carving the LevelDB data files.</w:t>
+        <w:t>3. The dynamic discovery of Profile 3 databases and the instant forensic reassembly of the 'deleted' code blocks by carving the LevelDB data files.</w:t>
       </w:r>
     </w:p>
     <w:p>
@@ -694,7 +694,7 @@
     </w:p>
     <w:p>
       <w:r>
-        <w:t>Speaker: Sapna (Lead Forensics Researcher, Verity Project)</w:t>
+        <w:t>Speaker: Dr. Sapna Vikram Mewundi (Lead Forensics Researcher, Verity Project)</w:t>
         <w:br/>
         <w:t>Previous Speaking Experience: Regular presenter at local security meetups, DEF CON Groups, and contributor to open-source forensic tools. First-time speaker at Black Hat Briefings.</w:t>
       </w:r>

</xml_diff>